<commit_message>
Initial package build (v2.5.5)
</commit_message>
<xml_diff>
--- a/docs/Boston/0_UNA_Setup.docx
+++ b/docs/Boston/0_UNA_Setup.docx
@@ -602,7 +602,7 @@
           <w:sz w:val="24"/>
           <w:szCs w:val="24"/>
         </w:rPr>
-        <w:t xml:space="preserve"> Navigate to the folder **(una-XXX\setup)** containing una.yml (which comes with your data download), where XXX is your version number.</w:t>
+        <w:t xml:space="preserve">Download the una.yml file from the UNA repository on GitHub (https://github.com/asevtsuk/urban_network_analysis, in the setup/ folder), then navigate Terminal to the folder where you saved it.</w:t>
       </w:r>
     </w:p>
     <w:p>
@@ -627,7 +627,7 @@
           <w:sz w:val="24"/>
           <w:szCs w:val="24"/>
         </w:rPr>
-        <w:t xml:space="preserve">In Windows, this folder is referenced as:”</w:t>
+        <w:t xml:space="preserve">In Windows, for example:</w:t>
       </w:r>
     </w:p>
     <w:p>
@@ -649,7 +649,7 @@
           <w:sz w:val="24"/>
           <w:szCs w:val="24"/>
         </w:rPr>
-        <w:t>cd “...\una-XXX\setup”</w:t>
+        <w:t xml:space="preserve">cd “...\Downloads”</w:t>
       </w:r>
     </w:p>
     <w:p>
@@ -670,7 +670,7 @@
           <w:sz w:val="24"/>
           <w:szCs w:val="24"/>
         </w:rPr>
-        <w:t xml:space="preserve">On MacOS, the folder is referenced as: cd ../una-XXX-dev/setup</w:t>
+        <w:t xml:space="preserve">On MacOS, for example:</w:t>
       </w:r>
     </w:p>
     <w:p>
@@ -692,7 +692,7 @@
           <w:sz w:val="24"/>
           <w:szCs w:val="24"/>
         </w:rPr>
-        <w:t>cd “.../una-XXX/setup”</w:t>
+        <w:t xml:space="preserve">cd “.../Downloads”</w:t>
       </w:r>
     </w:p>
     <w:p>
@@ -807,8 +807,22 @@
           <w:sz w:val="24"/>
           <w:szCs w:val="24"/>
         </w:rPr>
-        <w:t xml:space="preserve">Open Visual Studio Code, and open the folder  </w:t>
-      </w:r>
+        <w:t xml:space="preserve">Then install the UNA package into the environment, by typing:</w:t>
+      </w:r>
+    </w:p>
+    <w:p>
+      <w:pPr>
+        <w:pStyle w:val="ListParagraph"/>
+        <w:shd w:val="clear" w:color="auto" w:fill="F2F2F2"/>
+        <w:spacing w:before="40" w:after="40" w:line="276" w:lineRule="auto"/>
+        <w:ind w:left="360"/>
+        <w:rPr>
+          <w:rFonts w:ascii="Aptos" w:hAnsi="Aptos"/>
+          <w:color w:val="000000" w:themeColor="text1"/>
+          <w:sz w:val="24"/>
+          <w:szCs w:val="24"/>
+        </w:rPr>
+      </w:pPr>
       <w:r>
         <w:rPr>
           <w:rFonts w:ascii="Aptos" w:eastAsia="Consolas" w:hAnsi="Aptos" w:cs="Consolas"/>
@@ -816,7 +830,7 @@
           <w:sz w:val="24"/>
           <w:szCs w:val="24"/>
         </w:rPr>
-        <w:t>“.../una-XXX”</w:t>
+        <w:t xml:space="preserve">pip install git+https://github.com/asevtsuk/urban_network_analysis.git</w:t>
       </w:r>
     </w:p>
     <w:p>
@@ -841,7 +855,16 @@
           <w:sz w:val="24"/>
           <w:szCs w:val="24"/>
         </w:rPr>
-        <w:t>Terminal/New Terminal</w:t>
+        <w:t xml:space="preserve">Open Visual Studio Code, and open your project folder — any folder where you keep your UNA scripts and data.</w:t>
+      </w:r>
+      <w:r>
+        <w:rPr>
+          <w:rFonts w:ascii="Aptos" w:eastAsia="Consolas" w:hAnsi="Aptos" w:cs="Consolas"/>
+          <w:color w:val="000000" w:themeColor="text1"/>
+          <w:sz w:val="24"/>
+          <w:szCs w:val="24"/>
+        </w:rPr>
+        <w:t xml:space="preserve"/>
       </w:r>
     </w:p>
     <w:p>
@@ -866,7 +889,32 @@
           <w:sz w:val="24"/>
           <w:szCs w:val="24"/>
         </w:rPr>
-        <w:t xml:space="preserve">In the Terminal window, navigate to folder: cd </w:t>
+        <w:t>Terminal/New Terminal</w:t>
+      </w:r>
+    </w:p>
+    <w:p>
+      <w:pPr>
+        <w:pStyle w:val="ListParagraph"/>
+        <w:numPr>
+          <w:ilvl w:val="0"/>
+          <w:numId w:val="2"/>
+        </w:numPr>
+        <w:spacing w:before="20" w:after="20" w:line="276" w:lineRule="auto"/>
+        <w:rPr>
+          <w:rFonts w:ascii="Aptos" w:hAnsi="Aptos"/>
+          <w:color w:val="000000" w:themeColor="text1"/>
+          <w:sz w:val="24"/>
+          <w:szCs w:val="24"/>
+        </w:rPr>
+      </w:pPr>
+      <w:r>
+        <w:rPr>
+          <w:rFonts w:ascii="Aptos" w:hAnsi="Aptos"/>
+          <w:color w:val="000000" w:themeColor="text1"/>
+          <w:sz w:val="24"/>
+          <w:szCs w:val="24"/>
+        </w:rPr>
+        <w:t xml:space="preserve">In the Terminal window, navigate to your project folder: cd “.../your-project-folder”</w:t>
       </w:r>
       <w:r>
         <w:rPr>
@@ -875,7 +923,7 @@
           <w:sz w:val="24"/>
           <w:szCs w:val="24"/>
         </w:rPr>
-        <w:t>“.../una-XXX”</w:t>
+        <w:t xml:space="preserve"/>
       </w:r>
     </w:p>
     <w:p>

</xml_diff>

<commit_message>
Point URLs at City-Form-Lab; add RTD config
</commit_message>
<xml_diff>
--- a/docs/Boston/0_UNA_Setup.docx
+++ b/docs/Boston/0_UNA_Setup.docx
@@ -602,7 +602,7 @@
           <w:sz w:val="24"/>
           <w:szCs w:val="24"/>
         </w:rPr>
-        <w:t xml:space="preserve">Download the una.yml file from the UNA repository on GitHub (https://github.com/asevtsuk/urban_network_analysis, in the setup/ folder), then navigate Terminal to the folder where you saved it.</w:t>
+        <w:t xml:space="preserve">Download the una.yml file from the UNA repository on GitHub (https://github.com/City-Form-Lab/urban_network_analysis, in the setup/ folder), then navigate Terminal to the folder where you saved it.</w:t>
       </w:r>
     </w:p>
     <w:p>
@@ -830,7 +830,7 @@
           <w:sz w:val="24"/>
           <w:szCs w:val="24"/>
         </w:rPr>
-        <w:t xml:space="preserve">pip install git+https://github.com/asevtsuk/urban_network_analysis.git</w:t>
+        <w:t xml:space="preserve">pip install git+https://github.com/City-Form-Lab/urban_network_analysis.git</w:t>
       </w:r>
     </w:p>
     <w:p>

</xml_diff>